<commit_message>
update: documento fase 2 y unificado
</commit_message>
<xml_diff>
--- a/ProyectoIntegrador/Documentacion/fase_2/Fase2_AnalisisPrevioFuncional.docx
+++ b/ProyectoIntegrador/Documentacion/fase_2/Fase2_AnalisisPrevioFuncional.docx
@@ -19,16 +19,7 @@
           <w:sz w:val="28"/>
           <w:szCs w:val="28"/>
         </w:rPr>
-        <w:t>FASE 2 -</w:t>
-      </w:r>
-      <w:r>
-        <w:rPr>
-          <w:b/>
-          <w:bCs/>
-          <w:sz w:val="28"/>
-          <w:szCs w:val="28"/>
-        </w:rPr>
-        <w:t xml:space="preserve"> Análisis previo y funcional</w:t>
+        <w:t>FASE 2 - Análisis previo y funcional</w:t>
       </w:r>
     </w:p>
     <w:p/>
@@ -323,21 +314,7 @@
                 <w:sz w:val="20"/>
                 <w:szCs w:val="20"/>
               </w:rPr>
-              <w:t xml:space="preserve">Listar socios con </w:t>
-            </w:r>
-            <w:r>
-              <w:rPr>
-                <w:sz w:val="20"/>
-                <w:szCs w:val="20"/>
-              </w:rPr>
-              <w:t>vencimiento</w:t>
-            </w:r>
-            <w:r>
-              <w:rPr>
-                <w:sz w:val="20"/>
-                <w:szCs w:val="20"/>
-              </w:rPr>
-              <w:t xml:space="preserve"> hoy</w:t>
+              <w:t>Listar socios con vencimiento hoy</w:t>
             </w:r>
             <w:r>
               <w:rPr>
@@ -545,10 +522,10 @@
                 <w:szCs w:val="20"/>
               </w:rPr>
               <w:drawing>
-                <wp:inline distT="0" distB="0" distL="0" distR="0" wp14:anchorId="6FE9C7B4" wp14:editId="2B9B8998">
-                  <wp:extent cx="3784600" cy="1026748"/>
-                  <wp:effectExtent l="0" t="0" r="0" b="2540"/>
-                  <wp:docPr id="584348610" name="Imagen 2"/>
+                <wp:inline distT="0" distB="0" distL="0" distR="0" wp14:anchorId="0A40CF6E" wp14:editId="06B670CF">
+                  <wp:extent cx="3766820" cy="1079500"/>
+                  <wp:effectExtent l="0" t="0" r="5080" b="0"/>
+                  <wp:docPr id="892278985" name="Imagen 1"/>
                   <wp:cNvGraphicFramePr>
                     <a:graphicFrameLocks xmlns:a="http://schemas.openxmlformats.org/drawingml/2006/main" noChangeAspect="1"/>
                   </wp:cNvGraphicFramePr>
@@ -556,18 +533,18 @@
                     <a:graphicData uri="http://schemas.openxmlformats.org/drawingml/2006/picture">
                       <pic:pic xmlns:pic="http://schemas.openxmlformats.org/drawingml/2006/picture">
                         <pic:nvPicPr>
-                          <pic:cNvPr id="584348610" name="Imagen 584348610"/>
+                          <pic:cNvPr id="892278985" name="Imagen 892278985"/>
                           <pic:cNvPicPr/>
                         </pic:nvPicPr>
                         <pic:blipFill rotWithShape="1">
-                          <a:blip r:embed="rId5">
+                          <a:blip r:embed="rId6">
                             <a:extLst>
                               <a:ext uri="{28A0092B-C50C-407E-A947-70E740481C1C}">
                                 <a14:useLocalDpi xmlns:a14="http://schemas.microsoft.com/office/drawing/2010/main" val="0"/>
                               </a:ext>
                             </a:extLst>
                           </a:blip>
-                          <a:srcRect t="25929" b="25681"/>
+                          <a:srcRect t="25332" b="23400"/>
                           <a:stretch>
                             <a:fillRect/>
                           </a:stretch>
@@ -575,7 +552,7 @@
                         <pic:spPr bwMode="auto">
                           <a:xfrm>
                             <a:off x="0" y="0"/>
-                            <a:ext cx="3921389" cy="1063858"/>
+                            <a:ext cx="4033846" cy="1156025"/>
                           </a:xfrm>
                           <a:prstGeom prst="rect">
                             <a:avLst/>
@@ -1026,21 +1003,7 @@
                 <w:sz w:val="20"/>
                 <w:szCs w:val="20"/>
               </w:rPr>
-              <w:t xml:space="preserve">Se proporciona nombre y apellido y se </w:t>
-            </w:r>
-            <w:r>
-              <w:rPr>
-                <w:sz w:val="20"/>
-                <w:szCs w:val="20"/>
-              </w:rPr>
-              <w:t>obtiene</w:t>
-            </w:r>
-            <w:r>
-              <w:rPr>
-                <w:sz w:val="20"/>
-                <w:szCs w:val="20"/>
-              </w:rPr>
-              <w:t xml:space="preserve"> el ID.</w:t>
+              <w:t>Se proporciona nombre y apellido y se obtiene el ID.</w:t>
             </w:r>
           </w:p>
         </w:tc>
@@ -1184,23 +1147,7 @@
                 <w:szCs w:val="20"/>
                 <w:lang w:val="es-AR"/>
               </w:rPr>
-              <w:t xml:space="preserve"> el pago </w:t>
-            </w:r>
-            <w:r>
-              <w:rPr>
-                <w:sz w:val="20"/>
-                <w:szCs w:val="20"/>
-                <w:lang w:val="es-AR"/>
-              </w:rPr>
-              <w:t>tendrá</w:t>
-            </w:r>
-            <w:r>
-              <w:rPr>
-                <w:sz w:val="20"/>
-                <w:szCs w:val="20"/>
-                <w:lang w:val="es-AR"/>
-              </w:rPr>
-              <w:t xml:space="preserve"> inicio el primer</w:t>
+              <w:t xml:space="preserve"> el pago tendrá inicio el primer</w:t>
             </w:r>
             <w:r>
               <w:rPr>
@@ -1216,39 +1163,7 @@
                 <w:szCs w:val="20"/>
                 <w:lang w:val="es-AR"/>
               </w:rPr>
-              <w:t xml:space="preserve">y fin el </w:t>
-            </w:r>
-            <w:r>
-              <w:rPr>
-                <w:sz w:val="20"/>
-                <w:szCs w:val="20"/>
-                <w:lang w:val="es-AR"/>
-              </w:rPr>
-              <w:t>último</w:t>
-            </w:r>
-            <w:r>
-              <w:rPr>
-                <w:sz w:val="20"/>
-                <w:szCs w:val="20"/>
-                <w:lang w:val="es-AR"/>
-              </w:rPr>
-              <w:t xml:space="preserve"> </w:t>
-            </w:r>
-            <w:r>
-              <w:rPr>
-                <w:sz w:val="20"/>
-                <w:szCs w:val="20"/>
-                <w:lang w:val="es-AR"/>
-              </w:rPr>
-              <w:t>día</w:t>
-            </w:r>
-            <w:r>
-              <w:rPr>
-                <w:sz w:val="20"/>
-                <w:szCs w:val="20"/>
-                <w:lang w:val="es-AR"/>
-              </w:rPr>
-              <w:t xml:space="preserve"> del mes</w:t>
+              <w:t>y fin el último día del mes</w:t>
             </w:r>
             <w:r>
               <w:rPr>
@@ -1480,23 +1395,7 @@
                 <w:szCs w:val="20"/>
                 <w:lang w:val="es-AR"/>
               </w:rPr>
-              <w:t xml:space="preserve"> aquellos que </w:t>
-            </w:r>
-            <w:r>
-              <w:rPr>
-                <w:sz w:val="20"/>
-                <w:szCs w:val="20"/>
-                <w:lang w:val="es-AR"/>
-              </w:rPr>
-              <w:t>estén</w:t>
-            </w:r>
-            <w:r>
-              <w:rPr>
-                <w:sz w:val="20"/>
-                <w:szCs w:val="20"/>
-                <w:lang w:val="es-AR"/>
-              </w:rPr>
-              <w:t xml:space="preserve"> </w:t>
+              <w:t xml:space="preserve"> aquellos que estén </w:t>
             </w:r>
             <w:r>
               <w:rPr>

</xml_diff>